<commit_message>
Judges 재검증+재업로드 (2026-09-24): companies 수정(5d93e80)+소제목 띄어쓰기(6883679) 반영. validator PASS(21장), completeness PASS(352문단/793이름/152숫자), KJV 오염 잔여 0건, 재빌드 VERIFY_DROPPED=0, pairing 352행 OK, Google Doc 재업로드 API 21/21+export-back VERIFIED. reupload.py: workerF 레지스트리 fallback 추가.
</commit_message>
<xml_diff>
--- a/gdocs_build/Judges.docx
+++ b/gdocs_build/Judges.docx
@@ -360,7 +360,7 @@
               <w:rPr>
                 <w:sz w:val="18"/>
               </w:rPr>
-              <w:t>유다가 올라갔다. 하나님이 가나안 사람들과 브리스 사람들을 그들에게 넘겨주셨다. 그들은 베섹에서 그들을 무찔렀다 — 만 명이나!</w:t>
+              <w:t>유다가 올라갔다. 하나님이 가나안 사람들과 브리스 사람들을 그들에게 넘겨주셨다. 그들은 베섹에서 그들을 무찔렀다 — 열 부대나!</w:t>
             </w:r>
           </w:p>
         </w:tc>
@@ -3424,7 +3424,7 @@
               <w:rPr>
                 <w:sz w:val="18"/>
               </w:rPr>
-              <w:t>그때 그들은 모압 사람 만 명 정도를 쳐 죽였다. 모두 잘 먹고 튼튼한 자들이었다. 한 명도 살아남지 못했다. 그날 모압은 이스라엘의 손 아래 굴복했다. 그 땅이 여든 해 동안 조용했다.</w:t>
+              <w:t>그때 그들은 모압 사람 열 부대 정도를 쳐 죽였다. 모두 잘 먹고 튼튼한 자들이었다. 한 명도 살아남지 못했다. 그날 모압은 이스라엘의 손 아래 굴복했다. 그 땅이 여든 해 동안 조용했다.</w:t>
             </w:r>
           </w:p>
         </w:tc>
@@ -3865,7 +3865,7 @@
               <w:rPr>
                 <w:sz w:val="18"/>
               </w:rPr>
-              <w:t>그녀가 납달리 게데스에 있는 아비노암의 아들 바락을 불러 말했다. "하나님, 이스라엘의 하나님이 너에게 명령하시는 것이 분명해졌다. 다볼 산으로 가서 전투를 준비하라. 납달리와 스불론에서 만 명을 데려가라. 내가 야빈 군대의 사령관 시스라를 그의 모든 병거와 군대와 함께 기손 강으로 끌어내겠다. 그리고 네가 전투에서 이기게 해주겠다."</w:t>
+              <w:t>그녀가 납달리 게데스에 있는 아비노암의 아들 바락을 불러 말했다. "하나님, 이스라엘의 하나님이 너에게 명령하시는 것이 분명해졌다. 다볼 산으로 가서 전투를 준비하라. 납달리와 스불론에서 열 부대를 데려가라. 내가 야빈 군대의 사령관 시스라를 그의 모든 병거와 군대와 함께 기손 강으로 끌어내겠다. 그리고 네가 전투에서 이기게 해주겠다."</w:t>
             </w:r>
           </w:p>
         </w:tc>
@@ -4007,7 +4007,7 @@
               <w:rPr>
                 <w:sz w:val="18"/>
               </w:rPr>
-              <w:t>그녀가 말했다. "물론 함께 가겠다. 하지만 그런 태도라면 너에게는 영광이 없을 것이다. 하나님이 여자의 손을 써서 시스라를 처리하실 것이다." 드보라가 준비하고 바락과 함께 게데스로 갔다. 바락이 게데스에서 스불론과 납달리를 모았다. 만 명의 군사가 그를 따랐다. 드보라도 함께했다.</w:t>
+              <w:t>그녀가 말했다. "물론 함께 가겠다. 하지만 그런 태도라면 너에게는 영광이 없을 것이다. 하나님이 여자의 손을 써서 시스라를 처리하실 것이다." 드보라가 준비하고 바락과 함께 게데스로 갔다. 바락이 게데스에서 스불론과 납달리를 모았다. 열 부대의 군사가 그를 따랐다. 드보라도 함께했다.</w:t>
             </w:r>
           </w:p>
         </w:tc>
@@ -4149,7 +4149,7 @@
               <w:rPr>
                 <w:sz w:val="18"/>
               </w:rPr>
-              <w:t>드보라가 바락에게 말했다. "돌격하라! 바로 오늘이 하나님이 시스라를 이기게 하신 날이다. 하나님이 네 앞에서 행진하고 계시지 않느냐?" 바락이 다볼 산 비탈을 돌격해 내려갔고, 만 명의 군사가 그를 따랐다.</w:t>
+              <w:t>드보라가 바락에게 말했다. "돌격하라! 바로 오늘이 하나님이 시스라를 이기게 하신 날이다. 하나님이 네 앞에서 행진하고 계시지 않느냐?" 바락이 다볼 산 비탈을 돌격해 내려갔고, 열 부대의 군사가 그를 따랐다.</w:t>
             </w:r>
           </w:p>
         </w:tc>
@@ -5068,7 +5068,7 @@
               <w:rPr>
                 <w:sz w:val="18"/>
               </w:rPr>
-              <w:t>아낫의 아들 삼갈 시대에, 야엘 시대에, 큰길은 버려지고 나그네들은 뒷길로 다녔다. 전사들은 살찌고 게을러져 싸울 기력이 없었다. 그러다 당신, 드보라가 일어났다. 일어나 이스라엘의 어머니가 되었다. 하나님이 새 지도자들을 택하셨고, 그들이 성문에서 싸웠다. 이스라엘 사만 명 가운데 방패나 창 하나 보이지 않았다.</w:t>
+              <w:t>아낫의 아들 삼갈 시대에, 야엘 시대에, 큰길은 버려지고 나그네들은 뒷길로 다녔다. 전사들은 살찌고 게을러져 싸울 기력이 없었다. 그러다 당신, 드보라가 일어났다. 일어나 이스라엘의 어머니가 되었다. 하나님이 새 지도자들을 택하셨고, 그들이 성문에서 싸웠다. 이스라엘 마흔 부대 가운데 방패나 창 하나 보이지 않았다.</w:t>
             </w:r>
           </w:p>
         </w:tc>
@@ -9290,7 +9290,7 @@
               <w:rPr>
                 <w:sz w:val="18"/>
               </w:rPr>
-              <w:t>세바와 살문나는 동쪽 사람들의 전투 병력 중 남은 전부인 만 오천 명 정도의 군대와 함께 갈골에 있었다 — 그들은 십이만 명의 군사를 잃었다.</w:t>
+              <w:t>세바와 살문나는 동쪽 사람들의 전투 병력 중 남은 전부인 열다섯 부대 정도의 군대와 함께 갈골에 있었다 — 그들은 백스무 부대의 군사를 잃었다.</w:t>
             </w:r>
           </w:p>
         </w:tc>
@@ -14850,7 +14850,7 @@
               <w:rPr>
                 <w:sz w:val="18"/>
               </w:rPr>
-              <w:t>길르앗이 에브라임으로 건너가는 요단강 나루터를 장악했다. 도망치는 에브라임 사람이 "건너가게 해주시오"라고 말하면, 길르앗 사람들이 물었다. "너 에브라임 사람이냐?" 그러면 그가 "아니오"라고 말했다. 그러면 그들이 말했다. "'쉽볼렛'이라고 말해보라." 하지만 그는 항상 "시볼렛"이라고 말했다 — 제대로 말하지 못했다. 그러면 그들이 그를 붙잡아 요단강 나루터 거기서 죽였다. 그때 에브라임 사만 이천 부대가 죽었다.</w:t>
+              <w:t>길르앗이 에브라임으로 건너가는 요단강 나루터를 장악했다. 도망치는 에브라임 사람이 "건너가게 해주시오"라고 말하면, 길르앗 사람들이 물었다. "너 에브라임 사람이냐?" 그러면 그가 "아니오"라고 말했다. 그러면 그들이 말했다. "'쉽볼렛'이라고 말해보라." 하지만 그는 항상 "시볼렛"이라고 말했다 — 제대로 말하지 못했다. 그러면 그들이 그를 붙잡아 요단강 나루터 거기서 죽였다. 그때 에브라임 마흔두 부대가 죽었다.</w:t>
             </w:r>
           </w:p>
         </w:tc>
@@ -18355,7 +18355,7 @@
               <w:rPr>
                 <w:sz w:val="18"/>
               </w:rPr>
-              <w:t>유다에서 삼천 명이 에담 바위 동굴로 내려가 삼손에게 말했다. "블레셋 사람들이 이미 우리를 괴롭히고 지배하고 있다는 걸 모르느냐? 그런데 무슨 일로 일을 더 악화시키고 있느냐?" 그가 말했다. "눈에는 눈이다. 그들이 나에게 한 대로 나도 그들에게 했을 뿐이다."</w:t>
+              <w:t>유다에서 세 부대가 에담 바위 동굴로 내려가 삼손에게 말했다. "블레셋 사람들이 이미 우리를 괴롭히고 지배하고 있다는 걸 모르느냐? 그런데 무슨 일로 일을 더 악화시키고 있느냐?" 그가 말했다. "눈에는 눈이다. 그들이 나에게 한 대로 나도 그들에게 했을 뿐이다."</w:t>
             </w:r>
           </w:p>
         </w:tc>
@@ -24105,7 +24105,7 @@
               <w:rPr>
                 <w:sz w:val="18"/>
               </w:rPr>
-              <w:t>그러자 이스라엘 모든 백성이 나왔다. 회중이 미스바에서 하나님 앞에 모였다. 모두 거기 있었다. 단에서부터 브엘세바까지, 한 사람처럼! 모든 백성의 지도자들이 이스라엘 모든 지파를 대표해 하나님의 백성의 모임에 자리를 잡았다. 칼을 든 보병 사십만 명이었다.</w:t>
+              <w:t>그러자 이스라엘 모든 백성이 나왔다. 회중이 미스바에서 하나님 앞에 모였다. 모두 거기 있었다. 단에서부터 브엘세바까지, 한 사람처럼! 모든 백성의 지도자들이 이스라엘 모든 지파를 대표해 하나님의 백성의 모임에 자리를 잡았다. 칼을 든 보병 사백 부대였다.</w:t>
             </w:r>
           </w:p>
         </w:tc>
@@ -24460,7 +24460,7 @@
               <w:rPr>
                 <w:sz w:val="18"/>
               </w:rPr>
-              <w:t>그러나 그들은 하지 않았다. 베냐민 사람들은 형제인 이스라엘 사람들의 말을 듣기를 거부했다. 대신 모든 성읍에서 군대를 일으켜 기브아에 모여 이스라엘 사람들과 전쟁하러 나갔다. 순식간에 성읍들에서 칼을 든 보병 이십육만 명을 모집했다. 기브아에서는 엄선된 전사 칠백 명, 최고 정예를 얻었다. 또 다른 칠백 명의 명사수들이 있었는데 양손잡이였다 — 머리카락을 향해 돌을 던져도 빗나가지 않았다.</w:t>
+              <w:t>그러나 그들은 하지 않았다. 베냐민 사람들은 형제인 이스라엘 사람들의 말을 듣기를 거부했다. 대신 모든 성읍에서 군대를 일으켜 기브아에 모여 이스라엘 사람들과 전쟁하러 나갔다. 순식간에 성읍들에서 칼을 든 보병 스물여섯 부대를 모집했다. 기브아에서는 엄선된 전사 칠백 명, 최고 정예를 얻었다. 또 다른 칠백 명의 명사수들이 있었는데 양손잡이였다 — 머리카락을 향해 돌을 던져도 빗나가지 않았다.</w:t>
             </w:r>
           </w:p>
         </w:tc>
@@ -24531,7 +24531,7 @@
               <w:rPr>
                 <w:sz w:val="18"/>
               </w:rPr>
-              <w:t>베냐민을 제외한 이스라엘 사람들은 칼을 든 전투병 사십만 명을 동원했다.</w:t>
+              <w:t>베냐민을 제외한 이스라엘 사람들은 칼을 든 전투병 사백 부대를 동원했다.</w:t>
             </w:r>
           </w:p>
         </w:tc>
@@ -24673,7 +24673,7 @@
               <w:rPr>
                 <w:sz w:val="18"/>
               </w:rPr>
-              <w:t>이스라엘 사람들이 다음 날 아침 일어나 기브아 앞에 진을 쳤다. 이스라엘 군대가 베냐민을 대적해 진군해 기브아를 공격할 준비를 하고 자리를 잡았다. 그러나 베냐민 사람들이 기브아에서 쏟아져 나와 이스라엘 이십이만 명을 땅에 쓰러뜨렸다.</w:t>
+              <w:t>이스라엘 사람들이 다음 날 아침 일어나 기브아 앞에 진을 쳤다. 이스라엘 군대가 베냐민을 대적해 진군해 기브아를 공격할 준비를 하고 자리를 잡았다. 그러나 베냐민 사람들이 기브아에서 쏟아져 나와 이스라엘 스물두 부대를 땅에 쓰러뜨렸다.</w:t>
             </w:r>
           </w:p>
         </w:tc>
@@ -24886,7 +24886,7 @@
               <w:rPr>
                 <w:sz w:val="18"/>
               </w:rPr>
-              <w:t>군대가 용기를 냈다. 이스라엘 사람들이 첫날 배치했던 진지를 다시 잡았다. 둘째 날, 이스라엘 사람들이 다시 베냐민을 대적해 진군했다. 이번에는 베냐민 사람들이 성에서 나오자, 이 둘째 날에 이스라엘 십팔만 명을 또 쓰러뜨렸다. 모두 칼잡이들이었다.</w:t>
+              <w:t>군대가 용기를 냈다. 이스라엘 사람들이 첫날 배치했던 진지를 다시 잡았다. 둘째 날, 이스라엘 사람들이 다시 베냐민을 대적해 진군했다. 이번에는 베냐민 사람들이 성에서 나오자, 이 둘째 날에 이스라엘 열여덟 부대를 또 쓰러뜨렸다. 모두 칼잡이들이었다.</w:t>
             </w:r>
           </w:p>
         </w:tc>
@@ -25312,7 +25312,7 @@
               <w:rPr>
                 <w:sz w:val="18"/>
               </w:rPr>
-              <w:t>온 이스라엘에서 정예 만 명이 이제 기브아에 도착했다 — 치열하고 피비린내 나는 전투! 베냐민 사람들은 곧 패배할 줄 몰랐다 — 하나님이 이스라엘 앞에서 그들을 무너뜨리셨다. 이스라엘 사람들이 그날 베냐민 이십오만 명을 박살냈다 — 25,100명이 죽었다. 모두 칼잡이들이었다. 베냐민 사람들은 자기들이 졌다는 걸 알았다.</w:t>
+              <w:t>온 이스라엘에서 정예 열 부대가 이제 기브아에 도착했다 — 치열하고 피비린내 나는 전투! 베냐민 사람들은 곧 패배할 줄 몰랐다 — 하나님이 이스라엘 앞에서 그들을 무너뜨리셨다. 이스라엘 사람들이 그날 베냐민 스물다섯 부대를 박살냈다 — 25,100명이 죽었다. 모두 칼잡이들이었다. 베냐민 사람들은 자기들이 졌다는 걸 알았다.</w:t>
             </w:r>
           </w:p>
         </w:tc>
@@ -25596,7 +25596,7 @@
               <w:rPr>
                 <w:sz w:val="18"/>
               </w:rPr>
-              <w:t>베냐민 십팔만 명이 전멸했다. 모두 최고의 전사들이었다.</w:t>
+              <w:t>베냐민 열여덟 부대가 전멸했다. 모두 최고의 전사들이었다.</w:t>
             </w:r>
           </w:p>
         </w:tc>
@@ -25667,7 +25667,7 @@
               <w:rPr>
                 <w:sz w:val="18"/>
               </w:rPr>
-              <w:t>오만 명이 돌아서 광야의 림몬 바위로 도망쳤지만, 이스라엘 사람들이 길에서 그들을 붙잡아 죽였다. 압박을 계속하며 이스라엘 사람들은 이만 명을 더 쓰러뜨렸다.</w:t>
+              <w:t>다섯 부대가 돌아서 광야의 림몬 바위로 도망쳤지만, 이스라엘 사람들이 길에서 그들을 붙잡아 죽였다. 압박을 계속하며 이스라엘 사람들은 두 부대를 더 쓰러뜨렸다.</w:t>
             </w:r>
           </w:p>
         </w:tc>
@@ -25738,7 +25738,7 @@
               <w:rPr>
                 <w:sz w:val="18"/>
               </w:rPr>
-              <w:t>그날 죽은 베냐민 사람의 총수는 보병 이십오만 명이었다. 최고의 칼잡이들이었다.</w:t>
+              <w:t>그날 죽은 베냐민 사람의 총수는 보병 스물다섯 부대였다. 최고의 칼잡이들이었다.</w:t>
             </w:r>
           </w:p>
         </w:tc>
@@ -26489,7 +26489,7 @@
               <w:rPr>
                 <w:sz w:val="18"/>
               </w:rPr>
-              <w:t>그래서 회중이 정예 만 이천 명을 그리로 보내 이런 명령을 내렸다. "길르앗 야베스의 모든 사람을 죽여라. 여자와 아이들도 포함해서. 너희 지시는 이렇다. 성관계를 가진 남자와 여자는 모두 죽여라. 하지만 처녀들은 살려두어라." 그리고 그대로 했다.</w:t>
+              <w:t>그래서 회중이 정예 열두 부대를 그리로 보내 이런 명령을 내렸다. "길르앗 야베스의 모든 사람을 죽여라. 여자와 아이들도 포함해서. 너희 지시는 이렇다. 성관계를 가진 남자와 여자는 모두 죽여라. 하지만 처녀들은 살려두어라." 그리고 그대로 했다.</w:t>
             </w:r>
           </w:p>
         </w:tc>

</xml_diff>

<commit_message>
Judges 13:16 'Chill out.' 삭제 (성욱 승인) — EN/KO 1:1, GDocs 21/21 export-back verified
</commit_message>
<xml_diff>
--- a/gdocs_build/Judges.docx
+++ b/gdocs_build/Judges.docx
@@ -16565,7 +16565,7 @@
               <w:rPr>
                 <w:sz w:val="18"/>
               </w:rPr>
-              <w:t>But his wife said, "Chill out. If God were planning to kill us, he wouldn't have accepted our Whole-Burnt-Offering and Grain-Offering, or revealed all these things to us — given us this birth announcement."</w:t>
+              <w:t>But his wife said, "If God were planning to kill us, he wouldn't have accepted our Whole-Burnt-Offering and Grain-Offering, or revealed all these things to us — given us this birth announcement."</w:t>
             </w:r>
           </w:p>
         </w:tc>
@@ -16588,7 +16588,7 @@
               <w:rPr>
                 <w:sz w:val="18"/>
               </w:rPr>
-              <w:t>그러나 아내가 말했다. "진정해요. 하나님이 우리를 죽이실 생각이었다면, 우리의 통번제와 곡식 제물을 받지도 않으셨을 거고, 이런 것들을 다 보여주시지도 않았을 거예요 — 이 출생 소식을 주시지도 않았을 거고요."</w:t>
+              <w:t>그러나 아내가 말했다. "하나님이 우리를 죽이실 생각이었다면, 우리의 통번제와 곡식 제물을 받지도 않으셨을 거고, 이런 것들을 다 보여주시지도 않았을 거예요 — 이 출생 소식을 주시지도 않았을 거고요."</w:t>
             </w:r>
           </w:p>
         </w:tc>

</xml_diff>

<commit_message>
Judges 1:16: 성욱 지시로 "Moses' father-in-law" → "Moses' relative" (MSG 원문대로 복원)
- MSG 원문: "Moses' relative" (히브리어 관계 모호로 Peterson이 의도적으로 뭉뚱그림)
- EN + KO (모세의 친척) 반영
- Google Doc 업데이트: API 21/21, export-back VERIFIED OK
</commit_message>
<xml_diff>
--- a/gdocs_build/Judges.docx
+++ b/gdocs_build/Judges.docx
@@ -763,7 +763,7 @@
               <w:rPr>
                 <w:sz w:val="18"/>
               </w:rPr>
-              <w:t>The people of Hobab the Kenite, Moses' father-in-law, went up with the people of Judah from the City of Palms to the wilderness of Judah in the south near Arad. They went and lived there with the Amalekites.</w:t>
+              <w:t>The people of Hobab the Kenite, Moses' relative, went up with the people of Judah from the City of Palms to the wilderness of Judah in the south near Arad. They went and lived there with the Amalekites.</w:t>
             </w:r>
           </w:p>
         </w:tc>
@@ -786,7 +786,7 @@
               <w:rPr>
                 <w:sz w:val="18"/>
               </w:rPr>
-              <w:t>모세의 장인 호밥의 자손인 겐 사람들이 유다 사람들과 함께 종려나무 성에서 올라가 아랏 근처의 남쪽, 유다 광야로 갔다. 그들은 가서 아말렉 사람들과 함께 살았다.</w:t>
+              <w:t>모세의 친척 호밥의 자손인 겐 사람들이 유다 사람들과 함께 종려나무 성에서 올라가 아랏 근처의 남쪽, 유다 광야로 갔다. 그들은 가서 아말렉 사람들과 함께 살았다.</w:t>
             </w:r>
           </w:p>
         </w:tc>

</xml_diff>